<commit_message>
feat: update balance inicial
</commit_message>
<xml_diff>
--- a/Proyecto REACT Full Stack.docx
+++ b/Proyecto REACT Full Stack.docx
@@ -340,6 +340,74 @@
     </w:p>
     <w:p>
       <w:r>
+        <w:t>En la parte superior existirá un input de tipo numérico “Balance Inicial”. Este valor se usará para los cálculos de todo el balance a lo largo de los meses donde existan eventos registrados. Si el monto inicial es de $100 y en el primer mes se tiene solo un evento ingreso por $50 y un evento de tipo Egreso por 100$ eso significa que:</w:t>
+      </w:r>
+    </w:p>
+    <w:p>
+      <w:pPr>
+        <w:pStyle w:val="ListParagraph"/>
+        <w:numPr>
+          <w:ilvl w:val="0"/>
+          <w:numId w:val="5"/>
+        </w:numPr>
+      </w:pPr>
+      <w:r>
+        <w:t>El total ingresos de ese mes es: $100</w:t>
+      </w:r>
+    </w:p>
+    <w:p>
+      <w:pPr>
+        <w:pStyle w:val="ListParagraph"/>
+        <w:numPr>
+          <w:ilvl w:val="0"/>
+          <w:numId w:val="5"/>
+        </w:numPr>
+      </w:pPr>
+      <w:r>
+        <w:t>El total egresos de ese mes es: $50</w:t>
+      </w:r>
+    </w:p>
+    <w:p>
+      <w:pPr>
+        <w:pStyle w:val="ListParagraph"/>
+        <w:numPr>
+          <w:ilvl w:val="0"/>
+          <w:numId w:val="5"/>
+        </w:numPr>
+      </w:pPr>
+      <w:r>
+        <w:t>El balance de ese mes es: $100 (el único ingreso) - $50 (el único egreso) = $50</w:t>
+      </w:r>
+    </w:p>
+    <w:p>
+      <w:pPr>
+        <w:pStyle w:val="ListParagraph"/>
+        <w:numPr>
+          <w:ilvl w:val="0"/>
+          <w:numId w:val="5"/>
+        </w:numPr>
+      </w:pPr>
+      <w:r>
+        <w:t xml:space="preserve">El balance GLOBAL: $50 (balance del mes, </w:t>
+      </w:r>
+      <w:proofErr w:type="spellStart"/>
+      <w:r>
+        <w:t>calculo</w:t>
+      </w:r>
+      <w:proofErr w:type="spellEnd"/>
+      <w:r>
+        <w:t xml:space="preserve"> del punto anterior) + $100 (el monto inicial) = $150</w:t>
+      </w:r>
+    </w:p>
+    <w:p>
+      <w:r>
+        <w:t>Para los siguientes meses se debe tomar en cuenta ese valor del balance global del mes ANTERIOR. Debido a que el balance GLOBAL del mes anterior corresponde ahora al dinero disponible del usuario para el siguiente mes.</w:t>
+      </w:r>
+    </w:p>
+    <w:p/>
+    <w:p/>
+    <w:p>
+      <w:r>
         <w:t xml:space="preserve">Esta sección servirá para la presentación de los eventos creados por el usuario. Los eventos deberán estar agrupados por meses. Cada componente de </w:t>
       </w:r>
       <w:r>
@@ -382,6 +450,7 @@
         </w:numPr>
       </w:pPr>
       <w:r>
+        <w:lastRenderedPageBreak/>
         <w:t>Computo total de egresos del mes.</w:t>
       </w:r>
     </w:p>
@@ -492,68 +561,68 @@
         <w:pStyle w:val="Heading3"/>
       </w:pPr>
       <w:r>
+        <w:t>Formulario de evento</w:t>
+      </w:r>
+    </w:p>
+    <w:p>
+      <w:r>
+        <w:t>Esta sección servirá tanto para la creación como para la edición de eventos creados por el usuario.</w:t>
+      </w:r>
+      <w:r>
+        <w:t xml:space="preserve"> Si el usuario previamente dio clic en el botón “Crear evento”, entonces el formulario deberá estar limpio y con sus valores iniciales. En caso de que el usuario dio clic al botón de edición de algún evento, entonces el formulario deberá estar inicializado con los datos del evento seleccionado.</w:t>
+      </w:r>
+    </w:p>
+    <w:p/>
+    <w:p>
+      <w:r>
+        <w:t>El formulario deberá tomar en cuenta las validaciones de la entidad Evento para cada campo y mostrar un mensaje de error en el input correspondiente en caso de que el valor ingreso no cumpla con los requisitos del campo.</w:t>
+      </w:r>
+    </w:p>
+    <w:p/>
+    <w:p>
+      <w:r>
+        <w:t>El botón para persistir los cambios o los datos realizados en el formulario deberá ser “Crear evento” para cuando es un nuevo evento y “Actualizar evento” para cuando se está editando un evento existente.</w:t>
+      </w:r>
+    </w:p>
+    <w:p/>
+    <w:p>
+      <w:r>
+        <w:t>Al dar clic en guardar se deberá persistir los datos del formulario en el navegador (Local Storage) y redirigir al usuario a la vista Flujo del Balance la cual deberá reflejar los cambios realizados.</w:t>
+      </w:r>
+    </w:p>
+    <w:p>
+      <w:pPr>
+        <w:pStyle w:val="Heading3"/>
+      </w:pPr>
+      <w:r>
+        <w:t>Adicionales</w:t>
+      </w:r>
+    </w:p>
+    <w:p>
+      <w:r>
+        <w:t>La aplicicón deje tener un botón para intercambiar entre tema “light” y “dark”. Este valor debe estar presente en el global state y persistir si se refresca la página.</w:t>
+      </w:r>
+    </w:p>
+    <w:p/>
+    <w:p>
+      <w:pPr>
+        <w:pStyle w:val="Heading2"/>
+      </w:pPr>
+      <w:r>
+        <w:t>Puntos Extras</w:t>
+      </w:r>
+    </w:p>
+    <w:p>
+      <w:r>
+        <w:t>Para la obtención de puntos extra se requerirá que pueda implementar los siguientes requisitos.</w:t>
+      </w:r>
+    </w:p>
+    <w:p>
+      <w:pPr>
+        <w:pStyle w:val="Heading3"/>
+      </w:pPr>
+      <w:r>
         <w:lastRenderedPageBreak/>
-        <w:t>Formulario de evento</w:t>
-      </w:r>
-    </w:p>
-    <w:p>
-      <w:r>
-        <w:t>Esta sección servirá tanto para la creación como para la edición de eventos creados por el usuario.</w:t>
-      </w:r>
-      <w:r>
-        <w:t xml:space="preserve"> Si el usuario previamente dio clic en el botón “Crear evento”, entonces el formulario deberá estar limpio y con sus valores iniciales. En caso de que el usuario dio clic al botón de edición de algún evento, entonces el formulario deberá estar inicializado con los datos del evento seleccionado.</w:t>
-      </w:r>
-    </w:p>
-    <w:p/>
-    <w:p>
-      <w:r>
-        <w:t>El formulario deberá tomar en cuenta las validaciones de la entidad Evento para cada campo y mostrar un mensaje de error en el input correspondiente en caso de que el valor ingreso no cumpla con los requisitos del campo.</w:t>
-      </w:r>
-    </w:p>
-    <w:p/>
-    <w:p>
-      <w:r>
-        <w:t>El botón para persistir los cambios o los datos realizados en el formulario deberá ser “Crear evento” para cuando es un nuevo evento y “Actualizar evento” para cuando se está editando un evento existente.</w:t>
-      </w:r>
-    </w:p>
-    <w:p/>
-    <w:p>
-      <w:r>
-        <w:t>Al dar clic en guardar se deberá persistir los datos del formulario en el navegador (Local Storage) y redirigir al usuario a la vista Flujo del Balance la cual deberá reflejar los cambios realizados.</w:t>
-      </w:r>
-    </w:p>
-    <w:p>
-      <w:pPr>
-        <w:pStyle w:val="Heading3"/>
-      </w:pPr>
-      <w:r>
-        <w:t>Adicionales</w:t>
-      </w:r>
-    </w:p>
-    <w:p>
-      <w:r>
-        <w:t>La aplicicón deje tener un botón para intercambiar entre tema “light” y “dark”. Este valor debe estar presente en el global state y persistir si se refresca la página.</w:t>
-      </w:r>
-    </w:p>
-    <w:p/>
-    <w:p>
-      <w:pPr>
-        <w:pStyle w:val="Heading2"/>
-      </w:pPr>
-      <w:r>
-        <w:t>Puntos Extras</w:t>
-      </w:r>
-    </w:p>
-    <w:p>
-      <w:r>
-        <w:t>Para la obtención de puntos extra se requerirá que pueda implementar los siguientes requisitos.</w:t>
-      </w:r>
-    </w:p>
-    <w:p>
-      <w:pPr>
-        <w:pStyle w:val="Heading3"/>
-      </w:pPr>
-      <w:r>
         <w:t>Eventos</w:t>
       </w:r>
     </w:p>
@@ -641,7 +710,6 @@
     </w:p>
     <w:p>
       <w:r>
-        <w:lastRenderedPageBreak/>
         <w:t>Agregar un input con el objetivo de buscar un el mes deseado. Se puede encontrar por el nombre del mes y el año, ej: Diciembre 2024, Diciembre, etc. Tomar en cuenta el uso de debouncing para mejorar l experiencia y el rendimiento.</w:t>
       </w:r>
     </w:p>
@@ -970,6 +1038,119 @@
     </w:lvl>
   </w:abstractNum>
   <w:abstractNum w:abstractNumId="3" w15:restartNumberingAfterBreak="0">
+    <w:nsid w:val="3690010A"/>
+    <w:multiLevelType w:val="hybridMultilevel"/>
+    <w:tmpl w:val="8EDAA710"/>
+    <w:lvl w:ilvl="0" w:tplc="300A0001">
+      <w:start w:val="1"/>
+      <w:numFmt w:val="bullet"/>
+      <w:lvlText w:val=""/>
+      <w:lvlJc w:val="left"/>
+      <w:pPr>
+        <w:ind w:left="720" w:hanging="360"/>
+      </w:pPr>
+      <w:rPr>
+        <w:rFonts w:ascii="Symbol" w:hAnsi="Symbol" w:hint="default"/>
+      </w:rPr>
+    </w:lvl>
+    <w:lvl w:ilvl="1" w:tplc="300A0003" w:tentative="1">
+      <w:start w:val="1"/>
+      <w:numFmt w:val="bullet"/>
+      <w:lvlText w:val="o"/>
+      <w:lvlJc w:val="left"/>
+      <w:pPr>
+        <w:ind w:left="1440" w:hanging="360"/>
+      </w:pPr>
+      <w:rPr>
+        <w:rFonts w:ascii="Courier New" w:hAnsi="Courier New" w:cs="Courier New" w:hint="default"/>
+      </w:rPr>
+    </w:lvl>
+    <w:lvl w:ilvl="2" w:tplc="300A0005" w:tentative="1">
+      <w:start w:val="1"/>
+      <w:numFmt w:val="bullet"/>
+      <w:lvlText w:val=""/>
+      <w:lvlJc w:val="left"/>
+      <w:pPr>
+        <w:ind w:left="2160" w:hanging="360"/>
+      </w:pPr>
+      <w:rPr>
+        <w:rFonts w:ascii="Wingdings" w:hAnsi="Wingdings" w:hint="default"/>
+      </w:rPr>
+    </w:lvl>
+    <w:lvl w:ilvl="3" w:tplc="300A0001" w:tentative="1">
+      <w:start w:val="1"/>
+      <w:numFmt w:val="bullet"/>
+      <w:lvlText w:val=""/>
+      <w:lvlJc w:val="left"/>
+      <w:pPr>
+        <w:ind w:left="2880" w:hanging="360"/>
+      </w:pPr>
+      <w:rPr>
+        <w:rFonts w:ascii="Symbol" w:hAnsi="Symbol" w:hint="default"/>
+      </w:rPr>
+    </w:lvl>
+    <w:lvl w:ilvl="4" w:tplc="300A0003" w:tentative="1">
+      <w:start w:val="1"/>
+      <w:numFmt w:val="bullet"/>
+      <w:lvlText w:val="o"/>
+      <w:lvlJc w:val="left"/>
+      <w:pPr>
+        <w:ind w:left="3600" w:hanging="360"/>
+      </w:pPr>
+      <w:rPr>
+        <w:rFonts w:ascii="Courier New" w:hAnsi="Courier New" w:cs="Courier New" w:hint="default"/>
+      </w:rPr>
+    </w:lvl>
+    <w:lvl w:ilvl="5" w:tplc="300A0005" w:tentative="1">
+      <w:start w:val="1"/>
+      <w:numFmt w:val="bullet"/>
+      <w:lvlText w:val=""/>
+      <w:lvlJc w:val="left"/>
+      <w:pPr>
+        <w:ind w:left="4320" w:hanging="360"/>
+      </w:pPr>
+      <w:rPr>
+        <w:rFonts w:ascii="Wingdings" w:hAnsi="Wingdings" w:hint="default"/>
+      </w:rPr>
+    </w:lvl>
+    <w:lvl w:ilvl="6" w:tplc="300A0001" w:tentative="1">
+      <w:start w:val="1"/>
+      <w:numFmt w:val="bullet"/>
+      <w:lvlText w:val=""/>
+      <w:lvlJc w:val="left"/>
+      <w:pPr>
+        <w:ind w:left="5040" w:hanging="360"/>
+      </w:pPr>
+      <w:rPr>
+        <w:rFonts w:ascii="Symbol" w:hAnsi="Symbol" w:hint="default"/>
+      </w:rPr>
+    </w:lvl>
+    <w:lvl w:ilvl="7" w:tplc="300A0003" w:tentative="1">
+      <w:start w:val="1"/>
+      <w:numFmt w:val="bullet"/>
+      <w:lvlText w:val="o"/>
+      <w:lvlJc w:val="left"/>
+      <w:pPr>
+        <w:ind w:left="5760" w:hanging="360"/>
+      </w:pPr>
+      <w:rPr>
+        <w:rFonts w:ascii="Courier New" w:hAnsi="Courier New" w:cs="Courier New" w:hint="default"/>
+      </w:rPr>
+    </w:lvl>
+    <w:lvl w:ilvl="8" w:tplc="300A0005" w:tentative="1">
+      <w:start w:val="1"/>
+      <w:numFmt w:val="bullet"/>
+      <w:lvlText w:val=""/>
+      <w:lvlJc w:val="left"/>
+      <w:pPr>
+        <w:ind w:left="6480" w:hanging="360"/>
+      </w:pPr>
+      <w:rPr>
+        <w:rFonts w:ascii="Wingdings" w:hAnsi="Wingdings" w:hint="default"/>
+      </w:rPr>
+    </w:lvl>
+  </w:abstractNum>
+  <w:abstractNum w:abstractNumId="4" w15:restartNumberingAfterBreak="0">
     <w:nsid w:val="4ABE2908"/>
     <w:multiLevelType w:val="hybridMultilevel"/>
     <w:tmpl w:val="BA24A8A0"/>
@@ -1089,10 +1270,13 @@
     <w:abstractNumId w:val="1"/>
   </w:num>
   <w:num w:numId="3" w16cid:durableId="487600139">
-    <w:abstractNumId w:val="3"/>
+    <w:abstractNumId w:val="4"/>
   </w:num>
   <w:num w:numId="4" w16cid:durableId="1153453708">
     <w:abstractNumId w:val="0"/>
+  </w:num>
+  <w:num w:numId="5" w16cid:durableId="1308703798">
+    <w:abstractNumId w:val="3"/>
   </w:num>
 </w:numbering>
 </file>
@@ -2333,6 +2517,23 @@
 </file>
 
 <file path=customXml/item1.xml><?xml version="1.0" encoding="utf-8"?>
+<p:properties xmlns:p="http://schemas.microsoft.com/office/2006/metadata/properties" xmlns:xsi="http://www.w3.org/2001/XMLSchema-instance" xmlns:pc="http://schemas.microsoft.com/office/infopath/2007/PartnerControls">
+  <documentManagement>
+    <_activity xmlns="98b3f1ad-107c-497c-bb15-64aaebc89f52" xsi:nil="true"/>
+  </documentManagement>
+</p:properties>
+</file>
+
+<file path=customXml/item2.xml><?xml version="1.0" encoding="utf-8"?>
+<?mso-contentType ?>
+<FormTemplates xmlns="http://schemas.microsoft.com/sharepoint/v3/contenttype/forms">
+  <Display>DocumentLibraryForm</Display>
+  <Edit>DocumentLibraryForm</Edit>
+  <New>DocumentLibraryForm</New>
+</FormTemplates>
+</file>
+
+<file path=customXml/item3.xml><?xml version="1.0" encoding="utf-8"?>
 <ct:contentTypeSchema xmlns:ct="http://schemas.microsoft.com/office/2006/metadata/contentType" xmlns:ma="http://schemas.microsoft.com/office/2006/metadata/properties/metaAttributes" ct:_="" ma:_="" ma:contentTypeName="Documento" ma:contentTypeID="0x0101000ABC46EDA268834388609BD5B286F917" ma:contentTypeVersion="17" ma:contentTypeDescription="Crear nuevo documento." ma:contentTypeScope="" ma:versionID="b8ef759d716670bba47381dcbb7cab08">
   <xsd:schema xmlns:xsd="http://www.w3.org/2001/XMLSchema" xmlns:xs="http://www.w3.org/2001/XMLSchema" xmlns:p="http://schemas.microsoft.com/office/2006/metadata/properties" xmlns:ns3="98b3f1ad-107c-497c-bb15-64aaebc89f52" xmlns:ns4="a0690ee9-4047-4223-84b2-6b02f926f5d8" targetNamespace="http://schemas.microsoft.com/office/2006/metadata/properties" ma:root="true" ma:fieldsID="f0548e293e02a81e2d97140f47270d75" ns3:_="" ns4:_="">
     <xsd:import namespace="98b3f1ad-107c-497c-bb15-64aaebc89f52"/>
@@ -2579,24 +2780,25 @@
 </ct:contentTypeSchema>
 </file>
 
-<file path=customXml/item2.xml><?xml version="1.0" encoding="utf-8"?>
-<?mso-contentType ?>
-<FormTemplates xmlns="http://schemas.microsoft.com/sharepoint/v3/contenttype/forms">
-  <Display>DocumentLibraryForm</Display>
-  <Edit>DocumentLibraryForm</Edit>
-  <New>DocumentLibraryForm</New>
-</FormTemplates>
+<file path=customXml/itemProps1.xml><?xml version="1.0" encoding="utf-8"?>
+<ds:datastoreItem xmlns:ds="http://schemas.openxmlformats.org/officeDocument/2006/customXml" ds:itemID="{3A93A135-9757-427D-88E3-00FFC5B74CF3}">
+  <ds:schemaRefs>
+    <ds:schemaRef ds:uri="http://schemas.microsoft.com/office/2006/metadata/properties"/>
+    <ds:schemaRef ds:uri="http://schemas.microsoft.com/office/infopath/2007/PartnerControls"/>
+    <ds:schemaRef ds:uri="98b3f1ad-107c-497c-bb15-64aaebc89f52"/>
+  </ds:schemaRefs>
+</ds:datastoreItem>
 </file>
 
-<file path=customXml/item3.xml><?xml version="1.0" encoding="utf-8"?>
-<p:properties xmlns:p="http://schemas.microsoft.com/office/2006/metadata/properties" xmlns:xsi="http://www.w3.org/2001/XMLSchema-instance" xmlns:pc="http://schemas.microsoft.com/office/infopath/2007/PartnerControls">
-  <documentManagement>
-    <_activity xmlns="98b3f1ad-107c-497c-bb15-64aaebc89f52" xsi:nil="true"/>
-  </documentManagement>
-</p:properties>
+<file path=customXml/itemProps2.xml><?xml version="1.0" encoding="utf-8"?>
+<ds:datastoreItem xmlns:ds="http://schemas.openxmlformats.org/officeDocument/2006/customXml" ds:itemID="{A95C199E-A62D-49E5-A248-AEE50750AAFA}">
+  <ds:schemaRefs>
+    <ds:schemaRef ds:uri="http://schemas.microsoft.com/sharepoint/v3/contenttype/forms"/>
+  </ds:schemaRefs>
+</ds:datastoreItem>
 </file>
 
-<file path=customXml/itemProps1.xml><?xml version="1.0" encoding="utf-8"?>
+<file path=customXml/itemProps3.xml><?xml version="1.0" encoding="utf-8"?>
 <ds:datastoreItem xmlns:ds="http://schemas.openxmlformats.org/officeDocument/2006/customXml" ds:itemID="{84B1EFF7-73B6-492A-9608-57A2EED278E5}">
   <ds:schemaRefs>
     <ds:schemaRef ds:uri="http://schemas.microsoft.com/office/2006/metadata/contentType"/>
@@ -2613,22 +2815,4 @@
     <ds:schemaRef ds:uri="http://schemas.microsoft.com/internal/obd"/>
   </ds:schemaRefs>
 </ds:datastoreItem>
-</file>
-
-<file path=customXml/itemProps2.xml><?xml version="1.0" encoding="utf-8"?>
-<ds:datastoreItem xmlns:ds="http://schemas.openxmlformats.org/officeDocument/2006/customXml" ds:itemID="{A95C199E-A62D-49E5-A248-AEE50750AAFA}">
-  <ds:schemaRefs>
-    <ds:schemaRef ds:uri="http://schemas.microsoft.com/sharepoint/v3/contenttype/forms"/>
-  </ds:schemaRefs>
-</ds:datastoreItem>
-</file>
-
-<file path=customXml/itemProps3.xml><?xml version="1.0" encoding="utf-8"?>
-<ds:datastoreItem xmlns:ds="http://schemas.openxmlformats.org/officeDocument/2006/customXml" ds:itemID="{3A93A135-9757-427D-88E3-00FFC5B74CF3}">
-  <ds:schemaRefs>
-    <ds:schemaRef ds:uri="http://schemas.microsoft.com/office/2006/metadata/properties"/>
-    <ds:schemaRef ds:uri="http://schemas.microsoft.com/office/infopath/2007/PartnerControls"/>
-    <ds:schemaRef ds:uri="98b3f1ad-107c-497c-bb15-64aaebc89f52"/>
-  </ds:schemaRefs>
-</ds:datastoreItem>
 </file>
</xml_diff>